<commit_message>
Refactor resume generation to a shared template
</commit_message>
<xml_diff>
--- a/docs/resume/jp-samano-resume-en.docx
+++ b/docs/resume/jp-samano-resume-en.docx
@@ -9,176 +9,513 @@
       </w:pPr>
       <w:r>
         <w:rPr>
-          <w:rFonts w:ascii="Calibri" w:hAnsi="Calibri"/>
+          <w:rFonts w:ascii="Arial" w:hAnsi="Arial"/>
           <w:b/>
-          <w:color w:val="122033"/>
-          <w:sz w:val="36"/>
+          <w:i w:val="0"/>
+          <w:color w:val="000000"/>
+          <w:sz w:val="32"/>
         </w:rPr>
         <w:t>JOSE PABLO SAMANO SUAREZ</w:t>
       </w:r>
     </w:p>
     <w:p>
       <w:pPr>
-        <w:spacing w:after="36"/>
+        <w:spacing w:after="10"/>
         <w:jc w:val="center"/>
       </w:pPr>
       <w:r>
         <w:rPr>
-          <w:rFonts w:ascii="Calibri" w:hAnsi="Calibri"/>
-          <w:color w:val="555F6E"/>
-          <w:sz w:val="17"/>
+          <w:rFonts w:ascii="Arial" w:hAnsi="Arial"/>
+          <w:b w:val="0"/>
+          <w:i w:val="0"/>
+          <w:color w:val="000000"/>
+          <w:sz w:val="16"/>
         </w:rPr>
         <w:t>Computer Science Student | Software Engineering | Cybersecurity | Full-Stack Product Systems</w:t>
       </w:r>
     </w:p>
     <w:p>
       <w:pPr>
-        <w:spacing w:after="80"/>
+        <w:spacing w:after="30"/>
         <w:jc w:val="center"/>
       </w:pPr>
       <w:r>
         <w:rPr>
-          <w:rFonts w:ascii="Calibri" w:hAnsi="Calibri"/>
-          <w:color w:val="555F6E"/>
-          <w:sz w:val="16"/>
+          <w:rFonts w:ascii="Arial" w:hAnsi="Arial"/>
+          <w:b w:val="0"/>
+          <w:i w:val="0"/>
+          <w:color w:val="000000"/>
+          <w:sz w:val="14"/>
         </w:rPr>
         <w:t>Wolfville, NS / Mexico City | jpss2004@icloud.com | 6195978559 | linkedin.com/in/jose-pablo-samano-suarez | github.com/jpss2004-bot</w:t>
       </w:r>
     </w:p>
     <w:p>
       <w:pPr>
-        <w:pStyle w:val="ResumeHeading"/>
         <w:keepNext/>
+        <w:spacing w:before="60" w:after="24"/>
         <w:pBdr>
-          <w:bottom w:val="single" w:sz="8" w:space="3" w:color="C9D7EA"/>
+          <w:bottom w:val="single" w:sz="6" w:space="1" w:color="000000"/>
         </w:pBdr>
       </w:pPr>
       <w:r>
         <w:rPr>
+          <w:rFonts w:ascii="Arial" w:hAnsi="Arial"/>
           <w:b/>
+          <w:i w:val="0"/>
+          <w:color w:val="000000"/>
+          <w:sz w:val="16"/>
         </w:rPr>
-        <w:t>PROFILE</w:t>
+        <w:t>EDUCATION</w:t>
       </w:r>
     </w:p>
+    <w:tbl>
+      <w:tblPr>
+        <w:tblW w:type="auto" w:w="0"/>
+        <w:jc w:val="center"/>
+        <w:tblLayout w:type="fixed"/>
+        <w:tblLook w:firstColumn="1" w:firstRow="1" w:lastColumn="0" w:lastRow="0" w:noHBand="0" w:noVBand="1" w:val="04A0"/>
+        <w:tblBorders>
+          <w:top w:val="nil"/>
+          <w:left w:val="nil"/>
+          <w:bottom w:val="nil"/>
+          <w:right w:val="nil"/>
+          <w:insideH w:val="nil"/>
+          <w:insideV w:val="nil"/>
+        </w:tblBorders>
+      </w:tblPr>
+      <w:tblGrid>
+        <w:gridCol w:w="5429"/>
+        <w:gridCol w:w="5429"/>
+      </w:tblGrid>
+      <w:tr>
+        <w:tc>
+          <w:tcPr>
+            <w:tcW w:type="dxa" w:w="7992"/>
+            <w:vAlign w:val="top"/>
+            <w:tcMar>
+              <w:top w:w="0" w:type="dxa"/>
+              <w:start w:w="0" w:type="dxa"/>
+              <w:bottom w:w="0" w:type="dxa"/>
+              <w:end w:w="0" w:type="dxa"/>
+            </w:tcMar>
+          </w:tcPr>
+          <w:p>
+            <w:pPr>
+              <w:spacing w:after="0"/>
+            </w:pPr>
+            <w:r>
+              <w:rPr>
+                <w:rFonts w:ascii="Arial" w:hAnsi="Arial"/>
+                <w:b/>
+                <w:i w:val="0"/>
+                <w:color w:val="000000"/>
+                <w:sz w:val="16"/>
+              </w:rPr>
+              <w:t>Acadia University</w:t>
+            </w:r>
+          </w:p>
+        </w:tc>
+        <w:tc>
+          <w:tcPr>
+            <w:tcW w:type="dxa" w:w="2347"/>
+            <w:vAlign w:val="top"/>
+            <w:tcMar>
+              <w:top w:w="0" w:type="dxa"/>
+              <w:start w:w="0" w:type="dxa"/>
+              <w:bottom w:w="0" w:type="dxa"/>
+              <w:end w:w="0" w:type="dxa"/>
+            </w:tcMar>
+          </w:tcPr>
+          <w:p>
+            <w:pPr>
+              <w:spacing w:after="0"/>
+              <w:jc w:val="right"/>
+            </w:pPr>
+            <w:r>
+              <w:rPr>
+                <w:rFonts w:ascii="Arial" w:hAnsi="Arial"/>
+                <w:b w:val="0"/>
+                <w:i w:val="0"/>
+                <w:color w:val="000000"/>
+                <w:sz w:val="16"/>
+              </w:rPr>
+              <w:t>Wolfville, NS</w:t>
+            </w:r>
+          </w:p>
+        </w:tc>
+      </w:tr>
+      <w:tr>
+        <w:tc>
+          <w:tcPr>
+            <w:tcW w:type="dxa" w:w="7992"/>
+            <w:vAlign w:val="top"/>
+            <w:tcMar>
+              <w:top w:w="0" w:type="dxa"/>
+              <w:start w:w="0" w:type="dxa"/>
+              <w:bottom w:w="0" w:type="dxa"/>
+              <w:end w:w="0" w:type="dxa"/>
+            </w:tcMar>
+          </w:tcPr>
+          <w:p>
+            <w:pPr>
+              <w:spacing w:after="0"/>
+            </w:pPr>
+            <w:r>
+              <w:rPr>
+                <w:rFonts w:ascii="Arial" w:hAnsi="Arial"/>
+                <w:b w:val="0"/>
+                <w:i/>
+                <w:color w:val="000000"/>
+                <w:sz w:val="16"/>
+              </w:rPr>
+              <w:t>Bachelor of Science in Computer Science</w:t>
+            </w:r>
+          </w:p>
+        </w:tc>
+        <w:tc>
+          <w:tcPr>
+            <w:tcW w:type="dxa" w:w="2347"/>
+            <w:vAlign w:val="top"/>
+            <w:tcMar>
+              <w:top w:w="0" w:type="dxa"/>
+              <w:start w:w="0" w:type="dxa"/>
+              <w:bottom w:w="0" w:type="dxa"/>
+              <w:end w:w="0" w:type="dxa"/>
+            </w:tcMar>
+          </w:tcPr>
+          <w:p>
+            <w:pPr>
+              <w:spacing w:after="0"/>
+              <w:jc w:val="right"/>
+            </w:pPr>
+            <w:r>
+              <w:rPr>
+                <w:rFonts w:ascii="Arial" w:hAnsi="Arial"/>
+                <w:b/>
+                <w:i w:val="0"/>
+                <w:color w:val="000000"/>
+                <w:sz w:val="16"/>
+              </w:rPr>
+              <w:t>Expected May 2027</w:t>
+            </w:r>
+          </w:p>
+        </w:tc>
+      </w:tr>
+    </w:tbl>
     <w:p>
       <w:pPr>
-        <w:spacing w:after="60"/>
+        <w:pStyle w:val="ListBullet"/>
       </w:pPr>
       <w:r>
-        <w:t>Computer Science student at Acadia University focused on software engineering, full-stack development, cybersecurity, incident response, and practical product systems. Builds tools that connect technical logic, user workflows, data models, and clear evidence. Open to software engineering internships, cybersecurity-adjacent technical roles, and practical product collaborations.</w:t>
+        <w:rPr>
+          <w:rFonts w:ascii="Arial" w:hAnsi="Arial"/>
+          <w:b w:val="0"/>
+          <w:i w:val="0"/>
+          <w:color w:val="000000"/>
+          <w:sz w:val="15"/>
+        </w:rPr>
+        <w:t>Coursework and project focus: software engineering, data structures, databases, cybersecurity, systems analysis, human-machine interaction, cloud/security fundamentals, and secure application design.</w:t>
       </w:r>
     </w:p>
+    <w:tbl>
+      <w:tblPr>
+        <w:tblW w:type="auto" w:w="0"/>
+        <w:jc w:val="center"/>
+        <w:tblLayout w:type="fixed"/>
+        <w:tblLook w:firstColumn="1" w:firstRow="1" w:lastColumn="0" w:lastRow="0" w:noHBand="0" w:noVBand="1" w:val="04A0"/>
+        <w:tblBorders>
+          <w:top w:val="nil"/>
+          <w:left w:val="nil"/>
+          <w:bottom w:val="nil"/>
+          <w:right w:val="nil"/>
+          <w:insideH w:val="nil"/>
+          <w:insideV w:val="nil"/>
+        </w:tblBorders>
+      </w:tblPr>
+      <w:tblGrid>
+        <w:gridCol w:w="5429"/>
+        <w:gridCol w:w="5429"/>
+      </w:tblGrid>
+      <w:tr>
+        <w:tc>
+          <w:tcPr>
+            <w:tcW w:type="dxa" w:w="7992"/>
+            <w:vAlign w:val="top"/>
+            <w:tcMar>
+              <w:top w:w="0" w:type="dxa"/>
+              <w:start w:w="0" w:type="dxa"/>
+              <w:bottom w:w="0" w:type="dxa"/>
+              <w:end w:w="0" w:type="dxa"/>
+            </w:tcMar>
+          </w:tcPr>
+          <w:p>
+            <w:pPr>
+              <w:spacing w:after="0"/>
+            </w:pPr>
+            <w:r>
+              <w:rPr>
+                <w:rFonts w:ascii="Arial" w:hAnsi="Arial"/>
+                <w:b/>
+                <w:i w:val="0"/>
+                <w:color w:val="000000"/>
+                <w:sz w:val="16"/>
+              </w:rPr>
+              <w:t>Trinity College School</w:t>
+            </w:r>
+          </w:p>
+        </w:tc>
+        <w:tc>
+          <w:tcPr>
+            <w:tcW w:type="dxa" w:w="2347"/>
+            <w:vAlign w:val="top"/>
+            <w:tcMar>
+              <w:top w:w="0" w:type="dxa"/>
+              <w:start w:w="0" w:type="dxa"/>
+              <w:bottom w:w="0" w:type="dxa"/>
+              <w:end w:w="0" w:type="dxa"/>
+            </w:tcMar>
+          </w:tcPr>
+          <w:p>
+            <w:pPr>
+              <w:spacing w:after="0"/>
+              <w:jc w:val="right"/>
+            </w:pPr>
+            <w:r>
+              <w:rPr>
+                <w:rFonts w:ascii="Arial" w:hAnsi="Arial"/>
+                <w:b w:val="0"/>
+                <w:i w:val="0"/>
+                <w:color w:val="000000"/>
+                <w:sz w:val="16"/>
+              </w:rPr>
+              <w:t>Port Hope, ON</w:t>
+            </w:r>
+          </w:p>
+        </w:tc>
+      </w:tr>
+      <w:tr>
+        <w:tc>
+          <w:tcPr>
+            <w:tcW w:type="dxa" w:w="7992"/>
+            <w:vAlign w:val="top"/>
+            <w:tcMar>
+              <w:top w:w="0" w:type="dxa"/>
+              <w:start w:w="0" w:type="dxa"/>
+              <w:bottom w:w="0" w:type="dxa"/>
+              <w:end w:w="0" w:type="dxa"/>
+            </w:tcMar>
+          </w:tcPr>
+          <w:p>
+            <w:pPr>
+              <w:spacing w:after="0"/>
+            </w:pPr>
+            <w:r>
+              <w:rPr>
+                <w:rFonts w:ascii="Arial" w:hAnsi="Arial"/>
+                <w:b w:val="0"/>
+                <w:i/>
+                <w:color w:val="000000"/>
+                <w:sz w:val="16"/>
+              </w:rPr>
+              <w:t>High School Diploma</w:t>
+            </w:r>
+          </w:p>
+        </w:tc>
+        <w:tc>
+          <w:tcPr>
+            <w:tcW w:type="dxa" w:w="2347"/>
+            <w:vAlign w:val="top"/>
+            <w:tcMar>
+              <w:top w:w="0" w:type="dxa"/>
+              <w:start w:w="0" w:type="dxa"/>
+              <w:bottom w:w="0" w:type="dxa"/>
+              <w:end w:w="0" w:type="dxa"/>
+            </w:tcMar>
+          </w:tcPr>
+          <w:p>
+            <w:pPr>
+              <w:spacing w:after="0"/>
+              <w:jc w:val="right"/>
+            </w:pPr>
+            <w:r>
+              <w:rPr>
+                <w:rFonts w:ascii="Arial" w:hAnsi="Arial"/>
+                <w:b/>
+                <w:i w:val="0"/>
+                <w:color w:val="000000"/>
+                <w:sz w:val="16"/>
+              </w:rPr>
+              <w:t>June 2023</w:t>
+            </w:r>
+          </w:p>
+        </w:tc>
+      </w:tr>
+    </w:tbl>
     <w:p>
       <w:pPr>
-        <w:pStyle w:val="ResumeHeading"/>
         <w:keepNext/>
+        <w:spacing w:before="60" w:after="24"/>
         <w:pBdr>
-          <w:bottom w:val="single" w:sz="8" w:space="3" w:color="C9D7EA"/>
+          <w:bottom w:val="single" w:sz="6" w:space="1" w:color="000000"/>
         </w:pBdr>
       </w:pPr>
       <w:r>
         <w:rPr>
+          <w:rFonts w:ascii="Arial" w:hAnsi="Arial"/>
           <w:b/>
+          <w:i w:val="0"/>
+          <w:color w:val="000000"/>
+          <w:sz w:val="16"/>
         </w:rPr>
-        <w:t>EDUCATION</w:t>
+        <w:t>WORK EXPERIENCE</w:t>
       </w:r>
     </w:p>
+    <w:tbl>
+      <w:tblPr>
+        <w:tblW w:type="auto" w:w="0"/>
+        <w:jc w:val="center"/>
+        <w:tblLayout w:type="fixed"/>
+        <w:tblLook w:firstColumn="1" w:firstRow="1" w:lastColumn="0" w:lastRow="0" w:noHBand="0" w:noVBand="1" w:val="04A0"/>
+        <w:tblBorders>
+          <w:top w:val="nil"/>
+          <w:left w:val="nil"/>
+          <w:bottom w:val="nil"/>
+          <w:right w:val="nil"/>
+          <w:insideH w:val="nil"/>
+          <w:insideV w:val="nil"/>
+        </w:tblBorders>
+      </w:tblPr>
+      <w:tblGrid>
+        <w:gridCol w:w="5429"/>
+        <w:gridCol w:w="5429"/>
+      </w:tblGrid>
+      <w:tr>
+        <w:tc>
+          <w:tcPr>
+            <w:tcW w:type="dxa" w:w="7992"/>
+            <w:vAlign w:val="top"/>
+            <w:tcMar>
+              <w:top w:w="0" w:type="dxa"/>
+              <w:start w:w="0" w:type="dxa"/>
+              <w:bottom w:w="0" w:type="dxa"/>
+              <w:end w:w="0" w:type="dxa"/>
+            </w:tcMar>
+          </w:tcPr>
+          <w:p>
+            <w:pPr>
+              <w:spacing w:after="0"/>
+            </w:pPr>
+            <w:r>
+              <w:rPr>
+                <w:rFonts w:ascii="Arial" w:hAnsi="Arial"/>
+                <w:b/>
+                <w:i w:val="0"/>
+                <w:color w:val="000000"/>
+                <w:sz w:val="16"/>
+              </w:rPr>
+              <w:t>Cybolt</w:t>
+            </w:r>
+          </w:p>
+        </w:tc>
+        <w:tc>
+          <w:tcPr>
+            <w:tcW w:type="dxa" w:w="2347"/>
+            <w:vAlign w:val="top"/>
+            <w:tcMar>
+              <w:top w:w="0" w:type="dxa"/>
+              <w:start w:w="0" w:type="dxa"/>
+              <w:bottom w:w="0" w:type="dxa"/>
+              <w:end w:w="0" w:type="dxa"/>
+            </w:tcMar>
+          </w:tcPr>
+          <w:p>
+            <w:pPr>
+              <w:spacing w:after="0"/>
+              <w:jc w:val="right"/>
+            </w:pPr>
+            <w:r>
+              <w:rPr>
+                <w:rFonts w:ascii="Arial" w:hAnsi="Arial"/>
+                <w:b w:val="0"/>
+                <w:i w:val="0"/>
+                <w:color w:val="000000"/>
+                <w:sz w:val="16"/>
+              </w:rPr>
+              <w:t>Mexico City</w:t>
+            </w:r>
+          </w:p>
+        </w:tc>
+      </w:tr>
+      <w:tr>
+        <w:tc>
+          <w:tcPr>
+            <w:tcW w:type="dxa" w:w="7992"/>
+            <w:vAlign w:val="top"/>
+            <w:tcMar>
+              <w:top w:w="0" w:type="dxa"/>
+              <w:start w:w="0" w:type="dxa"/>
+              <w:bottom w:w="0" w:type="dxa"/>
+              <w:end w:w="0" w:type="dxa"/>
+            </w:tcMar>
+          </w:tcPr>
+          <w:p>
+            <w:pPr>
+              <w:spacing w:after="0"/>
+            </w:pPr>
+            <w:r>
+              <w:rPr>
+                <w:rFonts w:ascii="Arial" w:hAnsi="Arial"/>
+                <w:b w:val="0"/>
+                <w:i/>
+                <w:color w:val="000000"/>
+                <w:sz w:val="16"/>
+              </w:rPr>
+              <w:t>Cybolt Academy Participant</w:t>
+            </w:r>
+          </w:p>
+        </w:tc>
+        <w:tc>
+          <w:tcPr>
+            <w:tcW w:type="dxa" w:w="2347"/>
+            <w:vAlign w:val="top"/>
+            <w:tcMar>
+              <w:top w:w="0" w:type="dxa"/>
+              <w:start w:w="0" w:type="dxa"/>
+              <w:bottom w:w="0" w:type="dxa"/>
+              <w:end w:w="0" w:type="dxa"/>
+            </w:tcMar>
+          </w:tcPr>
+          <w:p>
+            <w:pPr>
+              <w:spacing w:after="0"/>
+              <w:jc w:val="right"/>
+            </w:pPr>
+            <w:r>
+              <w:rPr>
+                <w:rFonts w:ascii="Arial" w:hAnsi="Arial"/>
+                <w:b/>
+                <w:i w:val="0"/>
+                <w:color w:val="000000"/>
+                <w:sz w:val="16"/>
+              </w:rPr>
+              <w:t>May-Sep 2025</w:t>
+            </w:r>
+          </w:p>
+        </w:tc>
+      </w:tr>
+    </w:tbl>
     <w:p>
       <w:pPr>
-        <w:pStyle w:val="RoleTitle"/>
-        <w:keepNext/>
+        <w:pStyle w:val="ListBullet"/>
       </w:pPr>
       <w:r>
         <w:rPr>
-          <w:b/>
-          <w:color w:val="122033"/>
-        </w:rPr>
-        <w:t>Bachelor of Science, Computer Science, Acadia University</w:t>
-      </w:r>
-      <w:r>
-        <w:rPr>
-          <w:color w:val="555F6E"/>
-        </w:rPr>
-        <w:t xml:space="preserve"> | Wolfville, NS | Expected May 2027</w:t>
-      </w:r>
-    </w:p>
-    <w:p>
-      <w:pPr>
-        <w:pStyle w:val="ListBullet"/>
-        <w:spacing w:after="32" w:line="247" w:lineRule="auto"/>
-        <w:ind w:left="259" w:hanging="259"/>
-      </w:pPr>
-      <w:r>
-        <w:rPr>
-          <w:color w:val="122033"/>
-          <w:sz w:val="17"/>
-        </w:rPr>
-        <w:t>Coursework and project focus: software engineering, data structures, databases, cybersecurity, systems analysis, human-machine interaction, cloud/security fundamentals, and secure application design.</w:t>
-      </w:r>
-    </w:p>
-    <w:p>
-      <w:pPr>
-        <w:pStyle w:val="RoleTitle"/>
-        <w:keepNext/>
-      </w:pPr>
-      <w:r>
-        <w:rPr>
-          <w:b/>
-          <w:color w:val="122033"/>
-        </w:rPr>
-        <w:t>High School Diploma, Trinity College School</w:t>
-      </w:r>
-      <w:r>
-        <w:rPr>
-          <w:color w:val="555F6E"/>
-        </w:rPr>
-        <w:t xml:space="preserve"> | Port Hope, ON | June 2023</w:t>
-      </w:r>
-    </w:p>
-    <w:p>
-      <w:pPr>
-        <w:pStyle w:val="ResumeHeading"/>
-        <w:keepNext/>
-        <w:pBdr>
-          <w:bottom w:val="single" w:sz="8" w:space="3" w:color="C9D7EA"/>
-        </w:pBdr>
-      </w:pPr>
-      <w:r>
-        <w:rPr>
-          <w:b/>
-        </w:rPr>
-        <w:t>EXPERIENCE</w:t>
-      </w:r>
-    </w:p>
-    <w:p>
-      <w:pPr>
-        <w:pStyle w:val="RoleTitle"/>
-        <w:keepNext/>
-      </w:pPr>
-      <w:r>
-        <w:rPr>
-          <w:b/>
-          <w:color w:val="122033"/>
-        </w:rPr>
-        <w:t>Cybolt Academy Participant, Cybolt</w:t>
-      </w:r>
-      <w:r>
-        <w:rPr>
-          <w:color w:val="555F6E"/>
-        </w:rPr>
-        <w:t xml:space="preserve"> | Mexico City | May-Sep 2025</w:t>
-      </w:r>
-    </w:p>
-    <w:p>
-      <w:pPr>
-        <w:pStyle w:val="ListBullet"/>
-        <w:spacing w:after="32" w:line="247" w:lineRule="auto"/>
-        <w:ind w:left="259" w:hanging="259"/>
-      </w:pPr>
-      <w:r>
-        <w:rPr>
-          <w:color w:val="122033"/>
-          <w:sz w:val="17"/>
+          <w:rFonts w:ascii="Arial" w:hAnsi="Arial"/>
+          <w:b w:val="0"/>
+          <w:i w:val="0"/>
+          <w:color w:val="000000"/>
+          <w:sz w:val="15"/>
         </w:rPr>
         <w:t>Completed hands-on workshops on MITRE ATT&amp;CK, ICS/OT security, cyber kill chain, incident response, and defensive blue-team operations.</w:t>
       </w:r>
@@ -186,13 +523,14 @@
     <w:p>
       <w:pPr>
         <w:pStyle w:val="ListBullet"/>
-        <w:spacing w:after="32" w:line="247" w:lineRule="auto"/>
-        <w:ind w:left="259" w:hanging="259"/>
       </w:pPr>
       <w:r>
         <w:rPr>
-          <w:color w:val="122033"/>
-          <w:sz w:val="17"/>
+          <w:rFonts w:ascii="Arial" w:hAnsi="Arial"/>
+          <w:b w:val="0"/>
+          <w:i w:val="0"/>
+          <w:color w:val="000000"/>
+          <w:sz w:val="15"/>
         </w:rPr>
         <w:t>Analyzed adversary TTPs and ransomware behavior to connect attack patterns with detection, containment, investigation, and decision-making.</w:t>
       </w:r>
@@ -200,46 +538,163 @@
     <w:p>
       <w:pPr>
         <w:pStyle w:val="ListBullet"/>
-        <w:spacing w:after="32" w:line="247" w:lineRule="auto"/>
-        <w:ind w:left="259" w:hanging="259"/>
       </w:pPr>
       <w:r>
         <w:rPr>
-          <w:color w:val="122033"/>
-          <w:sz w:val="17"/>
+          <w:rFonts w:ascii="Arial" w:hAnsi="Arial"/>
+          <w:b w:val="0"/>
+          <w:i w:val="0"/>
+          <w:color w:val="000000"/>
+          <w:sz w:val="15"/>
         </w:rPr>
         <w:t>Built STAR-based incident-response interview cases, translating technical scenarios into clear, evidence-oriented narratives.</w:t>
       </w:r>
     </w:p>
+    <w:tbl>
+      <w:tblPr>
+        <w:tblW w:type="auto" w:w="0"/>
+        <w:jc w:val="center"/>
+        <w:tblLayout w:type="fixed"/>
+        <w:tblLook w:firstColumn="1" w:firstRow="1" w:lastColumn="0" w:lastRow="0" w:noHBand="0" w:noVBand="1" w:val="04A0"/>
+        <w:tblBorders>
+          <w:top w:val="nil"/>
+          <w:left w:val="nil"/>
+          <w:bottom w:val="nil"/>
+          <w:right w:val="nil"/>
+          <w:insideH w:val="nil"/>
+          <w:insideV w:val="nil"/>
+        </w:tblBorders>
+      </w:tblPr>
+      <w:tblGrid>
+        <w:gridCol w:w="5429"/>
+        <w:gridCol w:w="5429"/>
+      </w:tblGrid>
+      <w:tr>
+        <w:tc>
+          <w:tcPr>
+            <w:tcW w:type="dxa" w:w="7992"/>
+            <w:vAlign w:val="top"/>
+            <w:tcMar>
+              <w:top w:w="0" w:type="dxa"/>
+              <w:start w:w="0" w:type="dxa"/>
+              <w:bottom w:w="0" w:type="dxa"/>
+              <w:end w:w="0" w:type="dxa"/>
+            </w:tcMar>
+          </w:tcPr>
+          <w:p>
+            <w:pPr>
+              <w:spacing w:after="0"/>
+            </w:pPr>
+            <w:r>
+              <w:rPr>
+                <w:rFonts w:ascii="Arial" w:hAnsi="Arial"/>
+                <w:b/>
+                <w:i w:val="0"/>
+                <w:color w:val="000000"/>
+                <w:sz w:val="16"/>
+              </w:rPr>
+              <w:t>Michelin</w:t>
+            </w:r>
+          </w:p>
+        </w:tc>
+        <w:tc>
+          <w:tcPr>
+            <w:tcW w:type="dxa" w:w="2347"/>
+            <w:vAlign w:val="top"/>
+            <w:tcMar>
+              <w:top w:w="0" w:type="dxa"/>
+              <w:start w:w="0" w:type="dxa"/>
+              <w:bottom w:w="0" w:type="dxa"/>
+              <w:end w:w="0" w:type="dxa"/>
+            </w:tcMar>
+          </w:tcPr>
+          <w:p>
+            <w:pPr>
+              <w:spacing w:after="0"/>
+              <w:jc w:val="right"/>
+            </w:pPr>
+            <w:r>
+              <w:rPr>
+                <w:rFonts w:ascii="Arial" w:hAnsi="Arial"/>
+                <w:b w:val="0"/>
+                <w:i w:val="0"/>
+                <w:color w:val="000000"/>
+                <w:sz w:val="16"/>
+              </w:rPr>
+              <w:t>Waterville, NS</w:t>
+            </w:r>
+          </w:p>
+        </w:tc>
+      </w:tr>
+      <w:tr>
+        <w:tc>
+          <w:tcPr>
+            <w:tcW w:type="dxa" w:w="7992"/>
+            <w:vAlign w:val="top"/>
+            <w:tcMar>
+              <w:top w:w="0" w:type="dxa"/>
+              <w:start w:w="0" w:type="dxa"/>
+              <w:bottom w:w="0" w:type="dxa"/>
+              <w:end w:w="0" w:type="dxa"/>
+            </w:tcMar>
+          </w:tcPr>
+          <w:p>
+            <w:pPr>
+              <w:spacing w:after="0"/>
+            </w:pPr>
+            <w:r>
+              <w:rPr>
+                <w:rFonts w:ascii="Arial" w:hAnsi="Arial"/>
+                <w:b w:val="0"/>
+                <w:i/>
+                <w:color w:val="000000"/>
+                <w:sz w:val="16"/>
+              </w:rPr>
+              <w:t>Production Operator</w:t>
+            </w:r>
+          </w:p>
+        </w:tc>
+        <w:tc>
+          <w:tcPr>
+            <w:tcW w:type="dxa" w:w="2347"/>
+            <w:vAlign w:val="top"/>
+            <w:tcMar>
+              <w:top w:w="0" w:type="dxa"/>
+              <w:start w:w="0" w:type="dxa"/>
+              <w:bottom w:w="0" w:type="dxa"/>
+              <w:end w:w="0" w:type="dxa"/>
+            </w:tcMar>
+          </w:tcPr>
+          <w:p>
+            <w:pPr>
+              <w:spacing w:after="0"/>
+              <w:jc w:val="right"/>
+            </w:pPr>
+            <w:r>
+              <w:rPr>
+                <w:rFonts w:ascii="Arial" w:hAnsi="Arial"/>
+                <w:b/>
+                <w:i w:val="0"/>
+                <w:color w:val="000000"/>
+                <w:sz w:val="16"/>
+              </w:rPr>
+              <w:t>May-Sep 2024</w:t>
+            </w:r>
+          </w:p>
+        </w:tc>
+      </w:tr>
+    </w:tbl>
     <w:p>
       <w:pPr>
-        <w:pStyle w:val="RoleTitle"/>
-        <w:keepNext/>
+        <w:pStyle w:val="ListBullet"/>
       </w:pPr>
       <w:r>
         <w:rPr>
-          <w:b/>
-          <w:color w:val="122033"/>
-        </w:rPr>
-        <w:t>Production Operator, Michelin</w:t>
-      </w:r>
-      <w:r>
-        <w:rPr>
-          <w:color w:val="555F6E"/>
-        </w:rPr>
-        <w:t xml:space="preserve"> | Waterville, NS | May-Sep 2024</w:t>
-      </w:r>
-    </w:p>
-    <w:p>
-      <w:pPr>
-        <w:pStyle w:val="ListBullet"/>
-        <w:spacing w:after="32" w:line="247" w:lineRule="auto"/>
-        <w:ind w:left="259" w:hanging="259"/>
-      </w:pPr>
-      <w:r>
-        <w:rPr>
-          <w:color w:val="122033"/>
-          <w:sz w:val="17"/>
+          <w:rFonts w:ascii="Arial" w:hAnsi="Arial"/>
+          <w:b w:val="0"/>
+          <w:i w:val="0"/>
+          <w:color w:val="000000"/>
+          <w:sz w:val="15"/>
         </w:rPr>
         <w:t>Operated and monitored rubber-processing equipment in a high-pressure industrial environment while maintaining quality, safety, and consistency standards.</w:t>
       </w:r>
@@ -247,46 +702,163 @@
     <w:p>
       <w:pPr>
         <w:pStyle w:val="ListBullet"/>
-        <w:spacing w:after="32" w:line="247" w:lineRule="auto"/>
-        <w:ind w:left="259" w:hanging="259"/>
       </w:pPr>
       <w:r>
         <w:rPr>
-          <w:color w:val="122033"/>
-          <w:sz w:val="17"/>
+          <w:rFonts w:ascii="Arial" w:hAnsi="Arial"/>
+          <w:b w:val="0"/>
+          <w:i w:val="0"/>
+          <w:color w:val="000000"/>
+          <w:sz w:val="15"/>
         </w:rPr>
         <w:t>Identified and communicated production delays or equipment issues to reduce workflow interruptions and support plant continuity.</w:t>
       </w:r>
     </w:p>
+    <w:tbl>
+      <w:tblPr>
+        <w:tblW w:type="auto" w:w="0"/>
+        <w:jc w:val="center"/>
+        <w:tblLayout w:type="fixed"/>
+        <w:tblLook w:firstColumn="1" w:firstRow="1" w:lastColumn="0" w:lastRow="0" w:noHBand="0" w:noVBand="1" w:val="04A0"/>
+        <w:tblBorders>
+          <w:top w:val="nil"/>
+          <w:left w:val="nil"/>
+          <w:bottom w:val="nil"/>
+          <w:right w:val="nil"/>
+          <w:insideH w:val="nil"/>
+          <w:insideV w:val="nil"/>
+        </w:tblBorders>
+      </w:tblPr>
+      <w:tblGrid>
+        <w:gridCol w:w="5429"/>
+        <w:gridCol w:w="5429"/>
+      </w:tblGrid>
+      <w:tr>
+        <w:tc>
+          <w:tcPr>
+            <w:tcW w:type="dxa" w:w="7992"/>
+            <w:vAlign w:val="top"/>
+            <w:tcMar>
+              <w:top w:w="0" w:type="dxa"/>
+              <w:start w:w="0" w:type="dxa"/>
+              <w:bottom w:w="0" w:type="dxa"/>
+              <w:end w:w="0" w:type="dxa"/>
+            </w:tcMar>
+          </w:tcPr>
+          <w:p>
+            <w:pPr>
+              <w:spacing w:after="0"/>
+            </w:pPr>
+            <w:r>
+              <w:rPr>
+                <w:rFonts w:ascii="Arial" w:hAnsi="Arial"/>
+                <w:b/>
+                <w:i w:val="0"/>
+                <w:color w:val="000000"/>
+                <w:sz w:val="16"/>
+              </w:rPr>
+              <w:t>Legal Shelf</w:t>
+            </w:r>
+          </w:p>
+        </w:tc>
+        <w:tc>
+          <w:tcPr>
+            <w:tcW w:type="dxa" w:w="2347"/>
+            <w:vAlign w:val="top"/>
+            <w:tcMar>
+              <w:top w:w="0" w:type="dxa"/>
+              <w:start w:w="0" w:type="dxa"/>
+              <w:bottom w:w="0" w:type="dxa"/>
+              <w:end w:w="0" w:type="dxa"/>
+            </w:tcMar>
+          </w:tcPr>
+          <w:p>
+            <w:pPr>
+              <w:spacing w:after="0"/>
+              <w:jc w:val="right"/>
+            </w:pPr>
+            <w:r>
+              <w:rPr>
+                <w:rFonts w:ascii="Arial" w:hAnsi="Arial"/>
+                <w:b w:val="0"/>
+                <w:i w:val="0"/>
+                <w:color w:val="000000"/>
+                <w:sz w:val="16"/>
+              </w:rPr>
+              <w:t>Mexico City</w:t>
+            </w:r>
+          </w:p>
+        </w:tc>
+      </w:tr>
+      <w:tr>
+        <w:tc>
+          <w:tcPr>
+            <w:tcW w:type="dxa" w:w="7992"/>
+            <w:vAlign w:val="top"/>
+            <w:tcMar>
+              <w:top w:w="0" w:type="dxa"/>
+              <w:start w:w="0" w:type="dxa"/>
+              <w:bottom w:w="0" w:type="dxa"/>
+              <w:end w:w="0" w:type="dxa"/>
+            </w:tcMar>
+          </w:tcPr>
+          <w:p>
+            <w:pPr>
+              <w:spacing w:after="0"/>
+            </w:pPr>
+            <w:r>
+              <w:rPr>
+                <w:rFonts w:ascii="Arial" w:hAnsi="Arial"/>
+                <w:b w:val="0"/>
+                <w:i/>
+                <w:color w:val="000000"/>
+                <w:sz w:val="16"/>
+              </w:rPr>
+              <w:t>Data Processor</w:t>
+            </w:r>
+          </w:p>
+        </w:tc>
+        <w:tc>
+          <w:tcPr>
+            <w:tcW w:type="dxa" w:w="2347"/>
+            <w:vAlign w:val="top"/>
+            <w:tcMar>
+              <w:top w:w="0" w:type="dxa"/>
+              <w:start w:w="0" w:type="dxa"/>
+              <w:bottom w:w="0" w:type="dxa"/>
+              <w:end w:w="0" w:type="dxa"/>
+            </w:tcMar>
+          </w:tcPr>
+          <w:p>
+            <w:pPr>
+              <w:spacing w:after="0"/>
+              <w:jc w:val="right"/>
+            </w:pPr>
+            <w:r>
+              <w:rPr>
+                <w:rFonts w:ascii="Arial" w:hAnsi="Arial"/>
+                <w:b/>
+                <w:i w:val="0"/>
+                <w:color w:val="000000"/>
+                <w:sz w:val="16"/>
+              </w:rPr>
+              <w:t>May-Aug 2023</w:t>
+            </w:r>
+          </w:p>
+        </w:tc>
+      </w:tr>
+    </w:tbl>
     <w:p>
       <w:pPr>
-        <w:pStyle w:val="RoleTitle"/>
-        <w:keepNext/>
+        <w:pStyle w:val="ListBullet"/>
       </w:pPr>
       <w:r>
         <w:rPr>
-          <w:b/>
-          <w:color w:val="122033"/>
-        </w:rPr>
-        <w:t>Data Processor, Legal Shelf</w:t>
-      </w:r>
-      <w:r>
-        <w:rPr>
-          <w:color w:val="555F6E"/>
-        </w:rPr>
-        <w:t xml:space="preserve"> | Mexico City | May-Aug 2023</w:t>
-      </w:r>
-    </w:p>
-    <w:p>
-      <w:pPr>
-        <w:pStyle w:val="ListBullet"/>
-        <w:spacing w:after="32" w:line="247" w:lineRule="auto"/>
-        <w:ind w:left="259" w:hanging="259"/>
-      </w:pPr>
-      <w:r>
-        <w:rPr>
-          <w:color w:val="122033"/>
-          <w:sz w:val="17"/>
+          <w:rFonts w:ascii="Arial" w:hAnsi="Arial"/>
+          <w:b w:val="0"/>
+          <w:i w:val="0"/>
+          <w:color w:val="000000"/>
+          <w:sz w:val="15"/>
         </w:rPr>
         <w:t>Digitized, archived, and organized legal documents with structured metadata, improving retrieval, traceability, and file administration.</w:t>
       </w:r>
@@ -294,243 +866,108 @@
     <w:p>
       <w:pPr>
         <w:pStyle w:val="ListBullet"/>
-        <w:spacing w:after="32" w:line="247" w:lineRule="auto"/>
-        <w:ind w:left="259" w:hanging="259"/>
       </w:pPr>
       <w:r>
         <w:rPr>
-          <w:color w:val="122033"/>
-          <w:sz w:val="17"/>
+          <w:rFonts w:ascii="Arial" w:hAnsi="Arial"/>
+          <w:b w:val="0"/>
+          <w:i w:val="0"/>
+          <w:color w:val="000000"/>
+          <w:sz w:val="15"/>
         </w:rPr>
         <w:t>Handled sensitive information under strict confidentiality and data-protection practices during legal document processing.</w:t>
       </w:r>
     </w:p>
     <w:p>
       <w:pPr>
-        <w:pStyle w:val="ResumeHeading"/>
         <w:keepNext/>
+        <w:spacing w:before="60" w:after="24"/>
         <w:pBdr>
-          <w:bottom w:val="single" w:sz="8" w:space="3" w:color="C9D7EA"/>
+          <w:bottom w:val="single" w:sz="6" w:space="1" w:color="000000"/>
         </w:pBdr>
       </w:pPr>
       <w:r>
         <w:rPr>
+          <w:rFonts w:ascii="Arial" w:hAnsi="Arial"/>
           <w:b/>
+          <w:i w:val="0"/>
+          <w:color w:val="000000"/>
+          <w:sz w:val="16"/>
         </w:rPr>
-        <w:t>PROJECTS AND LEADERSHIP</w:t>
-      </w:r>
-    </w:p>
-    <w:p>
-      <w:pPr>
-        <w:pStyle w:val="RoleTitle"/>
-        <w:keepNext/>
-      </w:pPr>
-      <w:r>
-        <w:rPr>
-          <w:b/>
-          <w:color w:val="122033"/>
-        </w:rPr>
-        <w:t>Founder / Developer, SAVR - Context-Aware Dining Recommendation Platform</w:t>
-      </w:r>
-      <w:r>
-        <w:rPr>
-          <w:color w:val="555F6E"/>
-        </w:rPr>
-        <w:t xml:space="preserve"> | Wolfville, NS | 2025-Present</w:t>
-      </w:r>
-    </w:p>
-    <w:p>
-      <w:pPr>
-        <w:pStyle w:val="ListBullet"/>
-        <w:spacing w:after="32" w:line="247" w:lineRule="auto"/>
-        <w:ind w:left="259" w:hanging="259"/>
-      </w:pPr>
-      <w:r>
-        <w:rPr>
-          <w:color w:val="122033"/>
-          <w:sz w:val="17"/>
-        </w:rPr>
-        <w:t>Building a full-stack recommendation platform with FastAPI, React, TypeScript, and SQL that ranks restaurants using preferences, budget, social context, and user intent.</w:t>
-      </w:r>
-    </w:p>
-    <w:p>
-      <w:pPr>
-        <w:pStyle w:val="ListBullet"/>
-        <w:spacing w:after="32" w:line="247" w:lineRule="auto"/>
-        <w:ind w:left="259" w:hanging="259"/>
-      </w:pPr>
-      <w:r>
-        <w:rPr>
-          <w:color w:val="122033"/>
-          <w:sz w:val="17"/>
-        </w:rPr>
-        <w:t>Designed Describe Your Night, Build Your Night, and Surprise Me flows that connect structured inputs with prioritized, explainable recommendation cards.</w:t>
-      </w:r>
-    </w:p>
-    <w:p>
-      <w:pPr>
-        <w:pStyle w:val="ListBullet"/>
-        <w:spacing w:after="32" w:line="247" w:lineRule="auto"/>
-        <w:ind w:left="259" w:hanging="259"/>
-      </w:pPr>
-      <w:r>
-        <w:rPr>
-          <w:color w:val="122033"/>
-          <w:sz w:val="17"/>
-        </w:rPr>
-        <w:t>Implemented backend and frontend improvements across authentication, restaurant data, recommendation APIs, onboarding, presets, and result components.</w:t>
-      </w:r>
-    </w:p>
-    <w:p>
-      <w:pPr>
-        <w:pStyle w:val="RoleTitle"/>
-        <w:keepNext/>
-      </w:pPr>
-      <w:r>
-        <w:rPr>
-          <w:b/>
-          <w:color w:val="122033"/>
-        </w:rPr>
-        <w:t>Developer, Family Phrase Game</w:t>
-      </w:r>
-      <w:r>
-        <w:rPr>
-          <w:color w:val="555F6E"/>
-        </w:rPr>
-        <w:t xml:space="preserve"> | 2026</w:t>
-      </w:r>
-    </w:p>
-    <w:p>
-      <w:pPr>
-        <w:pStyle w:val="ListBullet"/>
-        <w:spacing w:after="32" w:line="247" w:lineRule="auto"/>
-        <w:ind w:left="259" w:hanging="259"/>
-      </w:pPr>
-      <w:r>
-        <w:rPr>
-          <w:color w:val="122033"/>
-          <w:sz w:val="17"/>
-        </w:rPr>
-        <w:t>Built and deployed a Flask web app that turns family-submitted phrases into a playable party game with phrase loading, scoring, and a simple live interface.</w:t>
-      </w:r>
-    </w:p>
-    <w:p>
-      <w:pPr>
-        <w:pStyle w:val="RoleTitle"/>
-        <w:keepNext/>
-      </w:pPr>
-      <w:r>
-        <w:rPr>
-          <w:b/>
-          <w:color w:val="122033"/>
-        </w:rPr>
-        <w:t>System Designer, ER Triage &amp; Queue Manager</w:t>
-      </w:r>
-      <w:r>
-        <w:rPr>
-          <w:color w:val="555F6E"/>
-        </w:rPr>
-        <w:t xml:space="preserve"> | 2025</w:t>
-      </w:r>
-    </w:p>
-    <w:p>
-      <w:pPr>
-        <w:pStyle w:val="ListBullet"/>
-        <w:spacing w:after="32" w:line="247" w:lineRule="auto"/>
-        <w:ind w:left="259" w:hanging="259"/>
-      </w:pPr>
-      <w:r>
-        <w:rPr>
-          <w:color w:val="122033"/>
-          <w:sz w:val="17"/>
-        </w:rPr>
-        <w:t>Modeled an emergency-room queue workflow around intake, vitals, priority scoring, patient state, status history, and dashboard visibility using Python, NiceGUI, and SQLite.</w:t>
-      </w:r>
-    </w:p>
-    <w:p>
-      <w:pPr>
-        <w:pStyle w:val="ResumeHeading"/>
-        <w:keepNext/>
-        <w:pBdr>
-          <w:bottom w:val="single" w:sz="8" w:space="3" w:color="C9D7EA"/>
-        </w:pBdr>
-      </w:pPr>
-      <w:r>
-        <w:rPr>
-          <w:b/>
-        </w:rPr>
-        <w:t>TECHNICAL SKILLS</w:t>
+        <w:t>PROJECTS</w:t>
       </w:r>
     </w:p>
     <w:tbl>
       <w:tblPr>
         <w:tblW w:type="auto" w:w="0"/>
+        <w:jc w:val="center"/>
         <w:tblLayout w:type="fixed"/>
         <w:tblLook w:firstColumn="1" w:firstRow="1" w:lastColumn="0" w:lastRow="0" w:noHBand="0" w:noVBand="1" w:val="04A0"/>
         <w:tblBorders>
-          <w:top w:val="single" w:sz="4" w:space="0" w:color="D8DEE8"/>
-          <w:left w:val="single" w:sz="4" w:space="0" w:color="D8DEE8"/>
-          <w:bottom w:val="single" w:sz="4" w:space="0" w:color="D8DEE8"/>
-          <w:right w:val="single" w:sz="4" w:space="0" w:color="D8DEE8"/>
-          <w:insideH w:val="single" w:sz="4" w:space="0" w:color="D8DEE8"/>
-          <w:insideV w:val="single" w:sz="4" w:space="0" w:color="D8DEE8"/>
+          <w:top w:val="nil"/>
+          <w:left w:val="nil"/>
+          <w:bottom w:val="nil"/>
+          <w:right w:val="nil"/>
+          <w:insideH w:val="nil"/>
+          <w:insideV w:val="nil"/>
         </w:tblBorders>
       </w:tblPr>
       <w:tblGrid>
-        <w:gridCol w:w="5371"/>
-        <w:gridCol w:w="5371"/>
+        <w:gridCol w:w="5429"/>
+        <w:gridCol w:w="5429"/>
       </w:tblGrid>
       <w:tr>
         <w:tc>
           <w:tcPr>
-            <w:tcW w:type="dxa" w:w="1843"/>
+            <w:tcW w:type="dxa" w:w="7992"/>
+            <w:vAlign w:val="top"/>
             <w:tcMar>
-              <w:top w:w="50" w:type="dxa"/>
-              <w:start w:w="90" w:type="dxa"/>
-              <w:bottom w:w="50" w:type="dxa"/>
-              <w:end w:w="90" w:type="dxa"/>
-            </w:tcMar>
-            <w:shd w:fill="E8EEF5"/>
-          </w:tcPr>
-          <w:p>
-            <w:pPr>
-              <w:spacing w:after="0"/>
-            </w:pPr>
-            <w:r/>
-            <w:r>
-              <w:rPr>
-                <w:rFonts w:ascii="Calibri" w:hAnsi="Calibri"/>
-                <w:b/>
-                <w:color w:val="1F4D78"/>
-                <w:sz w:val="17"/>
-              </w:rPr>
-              <w:t>Software</w:t>
-            </w:r>
-          </w:p>
-        </w:tc>
-        <w:tc>
-          <w:tcPr>
-            <w:tcW w:type="dxa" w:w="8899"/>
-            <w:tcMar>
-              <w:top w:w="50" w:type="dxa"/>
-              <w:start w:w="90" w:type="dxa"/>
-              <w:bottom w:w="50" w:type="dxa"/>
-              <w:end w:w="90" w:type="dxa"/>
+              <w:top w:w="0" w:type="dxa"/>
+              <w:start w:w="0" w:type="dxa"/>
+              <w:bottom w:w="0" w:type="dxa"/>
+              <w:end w:w="0" w:type="dxa"/>
             </w:tcMar>
           </w:tcPr>
           <w:p>
             <w:pPr>
               <w:spacing w:after="0"/>
             </w:pPr>
-            <w:r/>
             <w:r>
               <w:rPr>
-                <w:rFonts w:ascii="Calibri" w:hAnsi="Calibri"/>
+                <w:rFonts w:ascii="Arial" w:hAnsi="Arial"/>
+                <w:b/>
+                <w:i w:val="0"/>
+                <w:color w:val="000000"/>
+                <w:sz w:val="16"/>
+              </w:rPr>
+              <w:t>Family Phrase Game</w:t>
+            </w:r>
+          </w:p>
+        </w:tc>
+        <w:tc>
+          <w:tcPr>
+            <w:tcW w:type="dxa" w:w="2347"/>
+            <w:vAlign w:val="top"/>
+            <w:tcMar>
+              <w:top w:w="0" w:type="dxa"/>
+              <w:start w:w="0" w:type="dxa"/>
+              <w:bottom w:w="0" w:type="dxa"/>
+              <w:end w:w="0" w:type="dxa"/>
+            </w:tcMar>
+          </w:tcPr>
+          <w:p>
+            <w:pPr>
+              <w:spacing w:after="0"/>
+              <w:jc w:val="right"/>
+            </w:pPr>
+            <w:r>
+              <w:rPr>
+                <w:rFonts w:ascii="Arial" w:hAnsi="Arial"/>
                 <w:b w:val="0"/>
-                <w:color w:val="122033"/>
-                <w:sz w:val="17"/>
+                <w:i w:val="0"/>
+                <w:color w:val="000000"/>
+                <w:sz w:val="16"/>
               </w:rPr>
-              <w:t>Python, Java, JavaScript/TypeScript, C, C#, SQL, React, Next.js, FastAPI, Flask, REST APIs, Git</w:t>
             </w:r>
           </w:p>
         </w:tc>
@@ -538,54 +975,162 @@
       <w:tr>
         <w:tc>
           <w:tcPr>
-            <w:tcW w:type="dxa" w:w="1843"/>
+            <w:tcW w:type="dxa" w:w="7992"/>
+            <w:vAlign w:val="top"/>
             <w:tcMar>
-              <w:top w:w="50" w:type="dxa"/>
-              <w:start w:w="90" w:type="dxa"/>
-              <w:bottom w:w="50" w:type="dxa"/>
-              <w:end w:w="90" w:type="dxa"/>
-            </w:tcMar>
-            <w:shd w:fill="E8EEF5"/>
-          </w:tcPr>
-          <w:p>
-            <w:pPr>
-              <w:spacing w:after="0"/>
-            </w:pPr>
-            <w:r/>
-            <w:r>
-              <w:rPr>
-                <w:rFonts w:ascii="Calibri" w:hAnsi="Calibri"/>
-                <w:b/>
-                <w:color w:val="1F4D78"/>
-                <w:sz w:val="17"/>
-              </w:rPr>
-              <w:t>Data &amp; Delivery</w:t>
-            </w:r>
-          </w:p>
-        </w:tc>
-        <w:tc>
-          <w:tcPr>
-            <w:tcW w:type="dxa" w:w="8899"/>
-            <w:tcMar>
-              <w:top w:w="50" w:type="dxa"/>
-              <w:start w:w="90" w:type="dxa"/>
-              <w:bottom w:w="50" w:type="dxa"/>
-              <w:end w:w="90" w:type="dxa"/>
+              <w:top w:w="0" w:type="dxa"/>
+              <w:start w:w="0" w:type="dxa"/>
+              <w:bottom w:w="0" w:type="dxa"/>
+              <w:end w:w="0" w:type="dxa"/>
             </w:tcMar>
           </w:tcPr>
           <w:p>
             <w:pPr>
               <w:spacing w:after="0"/>
             </w:pPr>
-            <w:r/>
             <w:r>
               <w:rPr>
-                <w:rFonts w:ascii="Calibri" w:hAnsi="Calibri"/>
+                <w:rFonts w:ascii="Arial" w:hAnsi="Arial"/>
                 <w:b w:val="0"/>
-                <w:color w:val="122033"/>
-                <w:sz w:val="17"/>
+                <w:i/>
+                <w:color w:val="000000"/>
+                <w:sz w:val="16"/>
               </w:rPr>
-              <w:t>PostgreSQL, SQLite, SQLAlchemy, data modeling, validation, testing, Vercel, Render, documentation</w:t>
+              <w:t>Developer</w:t>
+            </w:r>
+          </w:p>
+        </w:tc>
+        <w:tc>
+          <w:tcPr>
+            <w:tcW w:type="dxa" w:w="2347"/>
+            <w:vAlign w:val="top"/>
+            <w:tcMar>
+              <w:top w:w="0" w:type="dxa"/>
+              <w:start w:w="0" w:type="dxa"/>
+              <w:bottom w:w="0" w:type="dxa"/>
+              <w:end w:w="0" w:type="dxa"/>
+            </w:tcMar>
+          </w:tcPr>
+          <w:p>
+            <w:pPr>
+              <w:spacing w:after="0"/>
+              <w:jc w:val="right"/>
+            </w:pPr>
+            <w:r>
+              <w:rPr>
+                <w:rFonts w:ascii="Arial" w:hAnsi="Arial"/>
+                <w:b/>
+                <w:i w:val="0"/>
+                <w:color w:val="000000"/>
+                <w:sz w:val="16"/>
+              </w:rPr>
+              <w:t>2026</w:t>
+            </w:r>
+          </w:p>
+        </w:tc>
+      </w:tr>
+    </w:tbl>
+    <w:p>
+      <w:pPr>
+        <w:spacing w:after="4"/>
+      </w:pPr>
+      <w:r>
+        <w:rPr>
+          <w:rFonts w:ascii="Arial" w:hAnsi="Arial"/>
+          <w:b w:val="0"/>
+          <w:i/>
+          <w:color w:val="000000"/>
+          <w:sz w:val="14"/>
+        </w:rPr>
+        <w:t>Flask | HTML | CSS | JavaScript | Render</w:t>
+      </w:r>
+    </w:p>
+    <w:p>
+      <w:pPr>
+        <w:pStyle w:val="ListBullet"/>
+      </w:pPr>
+      <w:r>
+        <w:rPr>
+          <w:rFonts w:ascii="Arial" w:hAnsi="Arial"/>
+          <w:b w:val="0"/>
+          <w:i w:val="0"/>
+          <w:color w:val="000000"/>
+          <w:sz w:val="15"/>
+        </w:rPr>
+        <w:t>Built and deployed a Flask web app that turns family-submitted phrases into a playable party game with phrase loading, scoring, and a simple live interface.</w:t>
+      </w:r>
+    </w:p>
+    <w:tbl>
+      <w:tblPr>
+        <w:tblW w:type="auto" w:w="0"/>
+        <w:jc w:val="center"/>
+        <w:tblLayout w:type="fixed"/>
+        <w:tblLook w:firstColumn="1" w:firstRow="1" w:lastColumn="0" w:lastRow="0" w:noHBand="0" w:noVBand="1" w:val="04A0"/>
+        <w:tblBorders>
+          <w:top w:val="nil"/>
+          <w:left w:val="nil"/>
+          <w:bottom w:val="nil"/>
+          <w:right w:val="nil"/>
+          <w:insideH w:val="nil"/>
+          <w:insideV w:val="nil"/>
+        </w:tblBorders>
+      </w:tblPr>
+      <w:tblGrid>
+        <w:gridCol w:w="5429"/>
+        <w:gridCol w:w="5429"/>
+      </w:tblGrid>
+      <w:tr>
+        <w:tc>
+          <w:tcPr>
+            <w:tcW w:type="dxa" w:w="7992"/>
+            <w:vAlign w:val="top"/>
+            <w:tcMar>
+              <w:top w:w="0" w:type="dxa"/>
+              <w:start w:w="0" w:type="dxa"/>
+              <w:bottom w:w="0" w:type="dxa"/>
+              <w:end w:w="0" w:type="dxa"/>
+            </w:tcMar>
+          </w:tcPr>
+          <w:p>
+            <w:pPr>
+              <w:spacing w:after="0"/>
+            </w:pPr>
+            <w:r>
+              <w:rPr>
+                <w:rFonts w:ascii="Arial" w:hAnsi="Arial"/>
+                <w:b/>
+                <w:i w:val="0"/>
+                <w:color w:val="000000"/>
+                <w:sz w:val="16"/>
+              </w:rPr>
+              <w:t>ER Triage &amp; Queue Manager</w:t>
+            </w:r>
+          </w:p>
+        </w:tc>
+        <w:tc>
+          <w:tcPr>
+            <w:tcW w:type="dxa" w:w="2347"/>
+            <w:vAlign w:val="top"/>
+            <w:tcMar>
+              <w:top w:w="0" w:type="dxa"/>
+              <w:start w:w="0" w:type="dxa"/>
+              <w:bottom w:w="0" w:type="dxa"/>
+              <w:end w:w="0" w:type="dxa"/>
+            </w:tcMar>
+          </w:tcPr>
+          <w:p>
+            <w:pPr>
+              <w:spacing w:after="0"/>
+              <w:jc w:val="right"/>
+            </w:pPr>
+            <w:r>
+              <w:rPr>
+                <w:rFonts w:ascii="Arial" w:hAnsi="Arial"/>
+                <w:b w:val="0"/>
+                <w:i w:val="0"/>
+                <w:color w:val="000000"/>
+                <w:sz w:val="16"/>
+              </w:rPr>
             </w:r>
           </w:p>
         </w:tc>
@@ -593,54 +1138,182 @@
       <w:tr>
         <w:tc>
           <w:tcPr>
-            <w:tcW w:type="dxa" w:w="1843"/>
+            <w:tcW w:type="dxa" w:w="7992"/>
+            <w:vAlign w:val="top"/>
             <w:tcMar>
-              <w:top w:w="50" w:type="dxa"/>
-              <w:start w:w="90" w:type="dxa"/>
-              <w:bottom w:w="50" w:type="dxa"/>
-              <w:end w:w="90" w:type="dxa"/>
-            </w:tcMar>
-            <w:shd w:fill="E8EEF5"/>
-          </w:tcPr>
-          <w:p>
-            <w:pPr>
-              <w:spacing w:after="0"/>
-            </w:pPr>
-            <w:r/>
-            <w:r>
-              <w:rPr>
-                <w:rFonts w:ascii="Calibri" w:hAnsi="Calibri"/>
-                <w:b/>
-                <w:color w:val="1F4D78"/>
-                <w:sz w:val="17"/>
-              </w:rPr>
-              <w:t>Cybersecurity</w:t>
-            </w:r>
-          </w:p>
-        </w:tc>
-        <w:tc>
-          <w:tcPr>
-            <w:tcW w:type="dxa" w:w="8899"/>
-            <w:tcMar>
-              <w:top w:w="50" w:type="dxa"/>
-              <w:start w:w="90" w:type="dxa"/>
-              <w:bottom w:w="50" w:type="dxa"/>
-              <w:end w:w="90" w:type="dxa"/>
+              <w:top w:w="0" w:type="dxa"/>
+              <w:start w:w="0" w:type="dxa"/>
+              <w:bottom w:w="0" w:type="dxa"/>
+              <w:end w:w="0" w:type="dxa"/>
             </w:tcMar>
           </w:tcPr>
           <w:p>
             <w:pPr>
               <w:spacing w:after="0"/>
             </w:pPr>
-            <w:r/>
             <w:r>
               <w:rPr>
-                <w:rFonts w:ascii="Calibri" w:hAnsi="Calibri"/>
+                <w:rFonts w:ascii="Arial" w:hAnsi="Arial"/>
                 <w:b w:val="0"/>
-                <w:color w:val="122033"/>
-                <w:sz w:val="17"/>
+                <w:i/>
+                <w:color w:val="000000"/>
+                <w:sz w:val="16"/>
               </w:rPr>
-              <w:t>Incident response, threat analysis, MITRE ATT&amp;CK, cyber kill chain, SOC fundamentals, ICS/OT security, authentication, access control</w:t>
+              <w:t>System Designer</w:t>
+            </w:r>
+          </w:p>
+        </w:tc>
+        <w:tc>
+          <w:tcPr>
+            <w:tcW w:type="dxa" w:w="2347"/>
+            <w:vAlign w:val="top"/>
+            <w:tcMar>
+              <w:top w:w="0" w:type="dxa"/>
+              <w:start w:w="0" w:type="dxa"/>
+              <w:bottom w:w="0" w:type="dxa"/>
+              <w:end w:w="0" w:type="dxa"/>
+            </w:tcMar>
+          </w:tcPr>
+          <w:p>
+            <w:pPr>
+              <w:spacing w:after="0"/>
+              <w:jc w:val="right"/>
+            </w:pPr>
+            <w:r>
+              <w:rPr>
+                <w:rFonts w:ascii="Arial" w:hAnsi="Arial"/>
+                <w:b/>
+                <w:i w:val="0"/>
+                <w:color w:val="000000"/>
+                <w:sz w:val="16"/>
+              </w:rPr>
+              <w:t>2025</w:t>
+            </w:r>
+          </w:p>
+        </w:tc>
+      </w:tr>
+    </w:tbl>
+    <w:p>
+      <w:pPr>
+        <w:spacing w:after="4"/>
+      </w:pPr>
+      <w:r>
+        <w:rPr>
+          <w:rFonts w:ascii="Arial" w:hAnsi="Arial"/>
+          <w:b w:val="0"/>
+          <w:i/>
+          <w:color w:val="000000"/>
+          <w:sz w:val="14"/>
+        </w:rPr>
+        <w:t>Python | NiceGUI | SQLite</w:t>
+      </w:r>
+    </w:p>
+    <w:p>
+      <w:pPr>
+        <w:pStyle w:val="ListBullet"/>
+      </w:pPr>
+      <w:r>
+        <w:rPr>
+          <w:rFonts w:ascii="Arial" w:hAnsi="Arial"/>
+          <w:b w:val="0"/>
+          <w:i w:val="0"/>
+          <w:color w:val="000000"/>
+          <w:sz w:val="15"/>
+        </w:rPr>
+        <w:t>Modeled an emergency-room workflow around intake, vitals, priority scoring, patient state, status history, and dashboard visibility.</w:t>
+      </w:r>
+    </w:p>
+    <w:p>
+      <w:pPr>
+        <w:keepNext/>
+        <w:spacing w:before="60" w:after="24"/>
+        <w:pBdr>
+          <w:bottom w:val="single" w:sz="6" w:space="1" w:color="000000"/>
+        </w:pBdr>
+      </w:pPr>
+      <w:r>
+        <w:rPr>
+          <w:rFonts w:ascii="Arial" w:hAnsi="Arial"/>
+          <w:b/>
+          <w:i w:val="0"/>
+          <w:color w:val="000000"/>
+          <w:sz w:val="16"/>
+        </w:rPr>
+        <w:t>LEADERSHIP EXPERIENCE</w:t>
+      </w:r>
+    </w:p>
+    <w:tbl>
+      <w:tblPr>
+        <w:tblW w:type="auto" w:w="0"/>
+        <w:jc w:val="center"/>
+        <w:tblLayout w:type="fixed"/>
+        <w:tblLook w:firstColumn="1" w:firstRow="1" w:lastColumn="0" w:lastRow="0" w:noHBand="0" w:noVBand="1" w:val="04A0"/>
+        <w:tblBorders>
+          <w:top w:val="nil"/>
+          <w:left w:val="nil"/>
+          <w:bottom w:val="nil"/>
+          <w:right w:val="nil"/>
+          <w:insideH w:val="nil"/>
+          <w:insideV w:val="nil"/>
+        </w:tblBorders>
+      </w:tblPr>
+      <w:tblGrid>
+        <w:gridCol w:w="5429"/>
+        <w:gridCol w:w="5429"/>
+      </w:tblGrid>
+      <w:tr>
+        <w:tc>
+          <w:tcPr>
+            <w:tcW w:type="dxa" w:w="7992"/>
+            <w:vAlign w:val="top"/>
+            <w:tcMar>
+              <w:top w:w="0" w:type="dxa"/>
+              <w:start w:w="0" w:type="dxa"/>
+              <w:bottom w:w="0" w:type="dxa"/>
+              <w:end w:w="0" w:type="dxa"/>
+            </w:tcMar>
+          </w:tcPr>
+          <w:p>
+            <w:pPr>
+              <w:spacing w:after="0"/>
+            </w:pPr>
+            <w:r>
+              <w:rPr>
+                <w:rFonts w:ascii="Arial" w:hAnsi="Arial"/>
+                <w:b/>
+                <w:i w:val="0"/>
+                <w:color w:val="000000"/>
+                <w:sz w:val="16"/>
+              </w:rPr>
+              <w:t>SAVR - Context-Aware Dining Recommendation Platform</w:t>
+            </w:r>
+          </w:p>
+        </w:tc>
+        <w:tc>
+          <w:tcPr>
+            <w:tcW w:type="dxa" w:w="2347"/>
+            <w:vAlign w:val="top"/>
+            <w:tcMar>
+              <w:top w:w="0" w:type="dxa"/>
+              <w:start w:w="0" w:type="dxa"/>
+              <w:bottom w:w="0" w:type="dxa"/>
+              <w:end w:w="0" w:type="dxa"/>
+            </w:tcMar>
+          </w:tcPr>
+          <w:p>
+            <w:pPr>
+              <w:spacing w:after="0"/>
+              <w:jc w:val="right"/>
+            </w:pPr>
+            <w:r>
+              <w:rPr>
+                <w:rFonts w:ascii="Arial" w:hAnsi="Arial"/>
+                <w:b w:val="0"/>
+                <w:i w:val="0"/>
+                <w:color w:val="000000"/>
+                <w:sz w:val="16"/>
+              </w:rPr>
+              <w:t>Wolfville, NS</w:t>
             </w:r>
           </w:p>
         </w:tc>
@@ -648,54 +1321,56 @@
       <w:tr>
         <w:tc>
           <w:tcPr>
-            <w:tcW w:type="dxa" w:w="1843"/>
+            <w:tcW w:type="dxa" w:w="7992"/>
+            <w:vAlign w:val="top"/>
             <w:tcMar>
-              <w:top w:w="50" w:type="dxa"/>
-              <w:start w:w="90" w:type="dxa"/>
-              <w:bottom w:w="50" w:type="dxa"/>
-              <w:end w:w="90" w:type="dxa"/>
-            </w:tcMar>
-            <w:shd w:fill="E8EEF5"/>
-          </w:tcPr>
-          <w:p>
-            <w:pPr>
-              <w:spacing w:after="0"/>
-            </w:pPr>
-            <w:r/>
-            <w:r>
-              <w:rPr>
-                <w:rFonts w:ascii="Calibri" w:hAnsi="Calibri"/>
-                <w:b/>
-                <w:color w:val="1F4D78"/>
-                <w:sz w:val="17"/>
-              </w:rPr>
-              <w:t>Languages</w:t>
-            </w:r>
-          </w:p>
-        </w:tc>
-        <w:tc>
-          <w:tcPr>
-            <w:tcW w:type="dxa" w:w="8899"/>
-            <w:tcMar>
-              <w:top w:w="50" w:type="dxa"/>
-              <w:start w:w="90" w:type="dxa"/>
-              <w:bottom w:w="50" w:type="dxa"/>
-              <w:end w:w="90" w:type="dxa"/>
+              <w:top w:w="0" w:type="dxa"/>
+              <w:start w:w="0" w:type="dxa"/>
+              <w:bottom w:w="0" w:type="dxa"/>
+              <w:end w:w="0" w:type="dxa"/>
             </w:tcMar>
           </w:tcPr>
           <w:p>
             <w:pPr>
               <w:spacing w:after="0"/>
             </w:pPr>
-            <w:r/>
             <w:r>
               <w:rPr>
-                <w:rFonts w:ascii="Calibri" w:hAnsi="Calibri"/>
+                <w:rFonts w:ascii="Arial" w:hAnsi="Arial"/>
                 <w:b w:val="0"/>
-                <w:color w:val="122033"/>
-                <w:sz w:val="17"/>
+                <w:i/>
+                <w:color w:val="000000"/>
+                <w:sz w:val="16"/>
               </w:rPr>
-              <w:t>Spanish native, English C2, French A2</w:t>
+              <w:t>Founder / Developer</w:t>
+            </w:r>
+          </w:p>
+        </w:tc>
+        <w:tc>
+          <w:tcPr>
+            <w:tcW w:type="dxa" w:w="2347"/>
+            <w:vAlign w:val="top"/>
+            <w:tcMar>
+              <w:top w:w="0" w:type="dxa"/>
+              <w:start w:w="0" w:type="dxa"/>
+              <w:bottom w:w="0" w:type="dxa"/>
+              <w:end w:w="0" w:type="dxa"/>
+            </w:tcMar>
+          </w:tcPr>
+          <w:p>
+            <w:pPr>
+              <w:spacing w:after="0"/>
+              <w:jc w:val="right"/>
+            </w:pPr>
+            <w:r>
+              <w:rPr>
+                <w:rFonts w:ascii="Arial" w:hAnsi="Arial"/>
+                <w:b/>
+                <w:i w:val="0"/>
+                <w:color w:val="000000"/>
+                <w:sz w:val="16"/>
+              </w:rPr>
+              <w:t>2025-Present</w:t>
             </w:r>
           </w:p>
         </w:tc>
@@ -703,56 +1378,228 @@
     </w:tbl>
     <w:p>
       <w:pPr>
-        <w:pStyle w:val="ResumeHeading"/>
+        <w:spacing w:after="4"/>
+      </w:pPr>
+      <w:r>
+        <w:rPr>
+          <w:rFonts w:ascii="Arial" w:hAnsi="Arial"/>
+          <w:b w:val="0"/>
+          <w:i/>
+          <w:color w:val="000000"/>
+          <w:sz w:val="14"/>
+        </w:rPr>
+        <w:t>FastAPI | React | TypeScript | SQL</w:t>
+      </w:r>
+    </w:p>
+    <w:p>
+      <w:pPr>
+        <w:pStyle w:val="ListBullet"/>
+      </w:pPr>
+      <w:r>
+        <w:rPr>
+          <w:rFonts w:ascii="Arial" w:hAnsi="Arial"/>
+          <w:b w:val="0"/>
+          <w:i w:val="0"/>
+          <w:color w:val="000000"/>
+          <w:sz w:val="15"/>
+        </w:rPr>
+        <w:t>Building a full-stack platform that ranks restaurants using preferences, budget, social context, and user intent.</w:t>
+      </w:r>
+    </w:p>
+    <w:p>
+      <w:pPr>
+        <w:pStyle w:val="ListBullet"/>
+      </w:pPr>
+      <w:r>
+        <w:rPr>
+          <w:rFonts w:ascii="Arial" w:hAnsi="Arial"/>
+          <w:b w:val="0"/>
+          <w:i w:val="0"/>
+          <w:color w:val="000000"/>
+          <w:sz w:val="15"/>
+        </w:rPr>
+        <w:t>Designed Describe Your Night, Build Your Night, and Surprise Me flows that turn structured inputs into prioritized, explainable recommendations.</w:t>
+      </w:r>
+    </w:p>
+    <w:p>
+      <w:pPr>
+        <w:pStyle w:val="ListBullet"/>
+      </w:pPr>
+      <w:r>
+        <w:rPr>
+          <w:rFonts w:ascii="Arial" w:hAnsi="Arial"/>
+          <w:b w:val="0"/>
+          <w:i w:val="0"/>
+          <w:color w:val="000000"/>
+          <w:sz w:val="15"/>
+        </w:rPr>
+        <w:t>Implemented backend and frontend improvements across authentication, restaurant data, recommendation APIs, onboarding, presets, and result components.</w:t>
+      </w:r>
+    </w:p>
+    <w:p>
+      <w:pPr>
         <w:keepNext/>
+        <w:spacing w:before="60" w:after="24"/>
         <w:pBdr>
-          <w:bottom w:val="single" w:sz="8" w:space="3" w:color="C9D7EA"/>
+          <w:bottom w:val="single" w:sz="6" w:space="1" w:color="000000"/>
         </w:pBdr>
       </w:pPr>
       <w:r>
         <w:rPr>
+          <w:rFonts w:ascii="Arial" w:hAnsi="Arial"/>
           <w:b/>
+          <w:i w:val="0"/>
+          <w:color w:val="000000"/>
+          <w:sz w:val="16"/>
+        </w:rPr>
+        <w:t>TECHNICAL SKILLS</w:t>
+      </w:r>
+    </w:p>
+    <w:p>
+      <w:pPr>
+        <w:spacing w:after="6"/>
+      </w:pPr>
+      <w:r>
+        <w:rPr>
+          <w:rFonts w:ascii="Arial" w:hAnsi="Arial"/>
+          <w:b/>
+          <w:i w:val="0"/>
+          <w:color w:val="000000"/>
+          <w:sz w:val="15"/>
+        </w:rPr>
+        <w:t xml:space="preserve">Software: </w:t>
+      </w:r>
+      <w:r>
+        <w:rPr>
+          <w:rFonts w:ascii="Arial" w:hAnsi="Arial"/>
+          <w:b w:val="0"/>
+          <w:i w:val="0"/>
+          <w:color w:val="000000"/>
+          <w:sz w:val="15"/>
+        </w:rPr>
+        <w:t>Python, Java, JavaScript/TypeScript, C, C#, SQL, React, Next.js, FastAPI, Flask, REST APIs, Git</w:t>
+      </w:r>
+    </w:p>
+    <w:p>
+      <w:pPr>
+        <w:spacing w:after="6"/>
+      </w:pPr>
+      <w:r>
+        <w:rPr>
+          <w:rFonts w:ascii="Arial" w:hAnsi="Arial"/>
+          <w:b/>
+          <w:i w:val="0"/>
+          <w:color w:val="000000"/>
+          <w:sz w:val="15"/>
+        </w:rPr>
+        <w:t xml:space="preserve">Data &amp; Delivery: </w:t>
+      </w:r>
+      <w:r>
+        <w:rPr>
+          <w:rFonts w:ascii="Arial" w:hAnsi="Arial"/>
+          <w:b w:val="0"/>
+          <w:i w:val="0"/>
+          <w:color w:val="000000"/>
+          <w:sz w:val="15"/>
+        </w:rPr>
+        <w:t>PostgreSQL, SQLite, SQLAlchemy, data modeling, validation, testing, Vercel, Render, documentation</w:t>
+      </w:r>
+    </w:p>
+    <w:p>
+      <w:pPr>
+        <w:spacing w:after="6"/>
+      </w:pPr>
+      <w:r>
+        <w:rPr>
+          <w:rFonts w:ascii="Arial" w:hAnsi="Arial"/>
+          <w:b/>
+          <w:i w:val="0"/>
+          <w:color w:val="000000"/>
+          <w:sz w:val="15"/>
+        </w:rPr>
+        <w:t xml:space="preserve">Cybersecurity: </w:t>
+      </w:r>
+      <w:r>
+        <w:rPr>
+          <w:rFonts w:ascii="Arial" w:hAnsi="Arial"/>
+          <w:b w:val="0"/>
+          <w:i w:val="0"/>
+          <w:color w:val="000000"/>
+          <w:sz w:val="15"/>
+        </w:rPr>
+        <w:t>Incident response, threat analysis, MITRE ATT&amp;CK, cyber kill chain, SOC fundamentals, ICS/OT security, authentication, access control</w:t>
+      </w:r>
+    </w:p>
+    <w:p>
+      <w:pPr>
+        <w:spacing w:after="6"/>
+      </w:pPr>
+      <w:r>
+        <w:rPr>
+          <w:rFonts w:ascii="Arial" w:hAnsi="Arial"/>
+          <w:b/>
+          <w:i w:val="0"/>
+          <w:color w:val="000000"/>
+          <w:sz w:val="15"/>
+        </w:rPr>
+        <w:t xml:space="preserve">Languages: </w:t>
+      </w:r>
+      <w:r>
+        <w:rPr>
+          <w:rFonts w:ascii="Arial" w:hAnsi="Arial"/>
+          <w:b w:val="0"/>
+          <w:i w:val="0"/>
+          <w:color w:val="000000"/>
+          <w:sz w:val="15"/>
+        </w:rPr>
+        <w:t>Spanish native, English C2, French A2</w:t>
+      </w:r>
+    </w:p>
+    <w:p>
+      <w:pPr>
+        <w:keepNext/>
+        <w:spacing w:before="60" w:after="24"/>
+        <w:pBdr>
+          <w:bottom w:val="single" w:sz="6" w:space="1" w:color="000000"/>
+        </w:pBdr>
+      </w:pPr>
+      <w:r>
+        <w:rPr>
+          <w:rFonts w:ascii="Arial" w:hAnsi="Arial"/>
+          <w:b/>
+          <w:i w:val="0"/>
+          <w:color w:val="000000"/>
+          <w:sz w:val="16"/>
         </w:rPr>
         <w:t>ADDITIONAL TRAINING</w:t>
       </w:r>
     </w:p>
     <w:p>
       <w:pPr>
-        <w:pStyle w:val="RoleTitle"/>
-        <w:keepNext/>
+        <w:pStyle w:val="ListBullet"/>
       </w:pPr>
       <w:r>
         <w:rPr>
-          <w:b/>
-          <w:color w:val="122033"/>
+          <w:rFonts w:ascii="Arial" w:hAnsi="Arial"/>
+          <w:b w:val="0"/>
+          <w:i w:val="0"/>
+          <w:color w:val="000000"/>
+          <w:sz w:val="15"/>
         </w:rPr>
-        <w:t>Security and professional development</w:t>
+        <w:t>CompTIA Security+ coursework, CompTIA CySA+ coursework, COMP 601 Cybersecurity Fundamentals, and MITRE ATT&amp;CK &amp; Incident Response Workshop.</w:t>
       </w:r>
     </w:p>
     <w:p>
       <w:pPr>
         <w:pStyle w:val="ListBullet"/>
-        <w:spacing w:after="32" w:line="247" w:lineRule="auto"/>
-        <w:ind w:left="259" w:hanging="259"/>
       </w:pPr>
       <w:r>
         <w:rPr>
-          <w:color w:val="122033"/>
-          <w:sz w:val="17"/>
-        </w:rPr>
-        <w:t>CompTIA Security+ coursework, CompTIA CySA+ coursework, COMP 601 Cybersecurity Fundamentals, MITRE ATT&amp;CK &amp; Incident Response Workshop.</w:t>
-      </w:r>
-    </w:p>
-    <w:p>
-      <w:pPr>
-        <w:pStyle w:val="ListBullet"/>
-        <w:spacing w:after="32" w:line="247" w:lineRule="auto"/>
-        <w:ind w:left="259" w:hanging="259"/>
-      </w:pPr>
-      <w:r>
-        <w:rPr>
-          <w:color w:val="122033"/>
-          <w:sz w:val="17"/>
+          <w:rFonts w:ascii="Arial" w:hAnsi="Arial"/>
+          <w:b w:val="0"/>
+          <w:i w:val="0"/>
+          <w:color w:val="000000"/>
+          <w:sz w:val="15"/>
         </w:rPr>
         <w:t>Ongoing practice in defensive security, incident-response interviews, technical documentation, adversary-behavior analysis, and SOC fundamentals.</w:t>
       </w:r>
@@ -760,7 +1607,7 @@
     <w:sectPr>
       <w:type w:val="continuous"/>
       <w:pgSz w:w="12240" w:h="15840"/>
-      <w:pgMar w:top="605" w:right="749" w:bottom="605" w:left="749" w:header="360" w:footer="360" w:gutter="0"/>
+      <w:pgMar w:top="518" w:right="691" w:bottom="518" w:left="691" w:header="288" w:footer="288" w:gutter="0"/>
       <w:cols w:space="720"/>
       <w:docGrid w:linePitch="360"/>
     </w:sectPr>
@@ -1132,12 +1979,12 @@
     <w:qFormat/>
     <w:rsid w:val="00FC693F"/>
     <w:pPr>
-      <w:spacing w:after="44" w:line="250" w:lineRule="auto"/>
+      <w:spacing w:after="10" w:line="240" w:lineRule="auto"/>
     </w:pPr>
     <w:rPr>
-      <w:rFonts w:ascii="Calibri" w:hAnsi="Calibri"/>
-      <w:color w:val="122033"/>
-      <w:sz w:val="17"/>
+      <w:rFonts w:ascii="Arial" w:hAnsi="Arial"/>
+      <w:color w:val="000000"/>
+      <w:sz w:val="16"/>
     </w:rPr>
   </w:style>
   <w:style w:type="paragraph" w:styleId="Header">
@@ -1557,13 +2404,14 @@
     <w:qFormat/>
     <w:rsid w:val="00FC693F"/>
     <w:pPr>
-      <w:spacing w:after="32" w:line="247" w:lineRule="auto"/>
-      <w:ind w:left="259" w:hanging="259"/>
+      <w:spacing w:after="4" w:line="240" w:lineRule="auto"/>
+      <w:ind w:left="202" w:hanging="144"/>
       <w:contextualSpacing/>
     </w:pPr>
     <w:rPr>
-      <w:rFonts w:ascii="Calibri" w:hAnsi="Calibri"/>
-      <w:sz w:val="17"/>
+      <w:rFonts w:ascii="Arial" w:hAnsi="Arial"/>
+      <w:color w:val="000000"/>
+      <w:sz w:val="15"/>
     </w:rPr>
   </w:style>
   <w:style w:type="paragraph" w:styleId="BodyText">
@@ -1671,13 +2519,14 @@
       <w:numPr>
         <w:numId w:val="1"/>
       </w:numPr>
-      <w:spacing w:after="32" w:line="247" w:lineRule="auto"/>
-      <w:ind w:left="259" w:hanging="259"/>
+      <w:spacing w:after="4" w:line="240" w:lineRule="auto"/>
+      <w:ind w:left="202" w:hanging="144"/>
       <w:contextualSpacing/>
     </w:pPr>
     <w:rPr>
-      <w:rFonts w:ascii="Calibri" w:hAnsi="Calibri"/>
-      <w:sz w:val="17"/>
+      <w:rFonts w:ascii="Arial" w:hAnsi="Arial"/>
+      <w:color w:val="000000"/>
+      <w:sz w:val="15"/>
     </w:rPr>
   </w:style>
   <w:style w:type="paragraph" w:styleId="ListBullet2">
@@ -12832,28 +13681,6 @@
         <w:shd w:val="clear" w:color="auto" w:fill="FBCAA2" w:themeFill="accent6" w:themeFillTint="7F"/>
       </w:tcPr>
     </w:tblStylePr>
-  </w:style>
-  <w:style w:type="paragraph" w:customStyle="1" w:styleId="ResumeHeading">
-    <w:name w:val="ResumeHeading"/>
-    <w:pPr>
-      <w:spacing w:before="110" w:after="46"/>
-    </w:pPr>
-    <w:rPr>
-      <w:rFonts w:ascii="Calibri" w:hAnsi="Calibri"/>
-      <w:b/>
-      <w:color w:val="1F4D78"/>
-      <w:sz w:val="20"/>
-    </w:rPr>
-  </w:style>
-  <w:style w:type="paragraph" w:customStyle="1" w:styleId="RoleTitle">
-    <w:name w:val="RoleTitle"/>
-    <w:pPr>
-      <w:spacing w:before="40" w:after="24"/>
-    </w:pPr>
-    <w:rPr>
-      <w:rFonts w:ascii="Calibri" w:hAnsi="Calibri"/>
-      <w:sz w:val="17"/>
-    </w:rPr>
   </w:style>
 </w:styles>
 </file>

</xml_diff>

<commit_message>
Resume: fold the data pipelines into the LegalShelf role
The database cleanup and metadata-extraction work was for LegalShelf, so
it becomes a fourth bullet under that role rather than a standalone
project entry.

Selected Projects is now only independent work: SAVR, ER Triage, and
Family Phrase Game. That separation is what makes the section mean
something, since everything paid now sits under Experience.

Both locales, both still one page.

Co-Authored-By: Claude Opus 5 <noreply@anthropic.com>
</commit_message>
<xml_diff>
--- a/docs/resume/jp-samano-resume-en.docx
+++ b/docs/resume/jp-samano-resume-en.docx
@@ -213,6 +213,20 @@
     </w:p>
     <w:p>
       <w:pPr>
+        <w:pStyle w:val="ListBullet"/>
+        <w:spacing w:after="24" w:line="247" w:lineRule="auto"/>
+        <w:ind w:left="259" w:hanging="259"/>
+      </w:pPr>
+      <w:r>
+        <w:rPr>
+          <w:color w:val="122033"/>
+          <w:sz w:val="17"/>
+        </w:rPr>
+        <w:t>Built database cleanup and metadata-extraction pipelines that make large document sets consistent, queryable, and reliable to process downstream.</w:t>
+      </w:r>
+    </w:p>
+    <w:p>
+      <w:pPr>
         <w:pStyle w:val="RoleTitle"/>
         <w:keepNext/>
       </w:pPr>
@@ -337,39 +351,6 @@
           <w:b/>
         </w:rPr>
         <w:t>SELECTED PROJECTS</w:t>
-      </w:r>
-    </w:p>
-    <w:p>
-      <w:pPr>
-        <w:pStyle w:val="RoleTitle"/>
-        <w:keepNext/>
-      </w:pPr>
-      <w:r>
-        <w:rPr>
-          <w:b/>
-          <w:color w:val="122033"/>
-        </w:rPr>
-        <w:t>Developer, Data Pipelines - Database Cleanup and Metadata Extraction</w:t>
-      </w:r>
-      <w:r>
-        <w:rPr>
-          <w:color w:val="555F6E"/>
-        </w:rPr>
-        <w:t xml:space="preserve"> | 2026</w:t>
-      </w:r>
-    </w:p>
-    <w:p>
-      <w:pPr>
-        <w:pStyle w:val="ListBullet"/>
-        <w:spacing w:after="24" w:line="247" w:lineRule="auto"/>
-        <w:ind w:left="259" w:hanging="259"/>
-      </w:pPr>
-      <w:r>
-        <w:rPr>
-          <w:color w:val="122033"/>
-          <w:sz w:val="17"/>
-        </w:rPr>
-        <w:t>Built database cleanup and metadata-extraction pipelines to make large document sets consistent, queryable, and reliable to process downstream.</w:t>
       </w:r>
     </w:p>
     <w:p>

</xml_diff>